<commit_message>
feat: api nhập bệnh án cũ
</commit_message>
<xml_diff>
--- a/core/src/templates/prescription_template.docx
+++ b/core/src/templates/prescription_template.docx
@@ -4,8 +4,8 @@
   <w:body>
     <w:p>
       <w:pPr>
-        <w:spacing w:after="120" w:line="240" w:lineRule="auto"/>
-        <w:ind w:left="-425" w:right="-436"/>
+        <w:spacing w:line="240" w:lineRule="auto"/>
+        <w:ind w:left="-425" w:right="-437"/>
         <w:rPr>
           <w:rFonts w:ascii="Times New Roman" w:eastAsia="Times New Roman" w:hAnsi="Times New Roman" w:cs="Times New Roman"/>
           <w:b/>
@@ -23,128 +23,42 @@
           <w:szCs w:val="20"/>
           <w:lang w:val="en-US"/>
         </w:rPr>
-        <w:t>{{clinicName}}</w:t>
-      </w:r>
-      <w:r>
-        <w:rPr>
-          <w:rFonts w:ascii="Times New Roman" w:eastAsia="Times New Roman" w:hAnsi="Times New Roman" w:cs="Times New Roman"/>
-          <w:b/>
-          <w:bCs/>
-          <w:sz w:val="20"/>
-          <w:szCs w:val="20"/>
-        </w:rPr>
-        <w:tab/>
-      </w:r>
-      <w:r>
-        <w:rPr>
-          <w:rFonts w:ascii="Times New Roman" w:eastAsia="Times New Roman" w:hAnsi="Times New Roman" w:cs="Times New Roman"/>
-          <w:b/>
-          <w:bCs/>
-          <w:sz w:val="20"/>
-          <w:szCs w:val="20"/>
-        </w:rPr>
-        <w:tab/>
-      </w:r>
-      <w:r>
-        <w:rPr>
-          <w:rFonts w:ascii="Times New Roman" w:eastAsia="Times New Roman" w:hAnsi="Times New Roman" w:cs="Times New Roman"/>
-          <w:b/>
-          <w:bCs/>
-          <w:sz w:val="20"/>
-          <w:szCs w:val="20"/>
-        </w:rPr>
-        <w:tab/>
-      </w:r>
-      <w:r>
-        <w:rPr>
-          <w:rFonts w:ascii="Times New Roman" w:eastAsia="Times New Roman" w:hAnsi="Times New Roman" w:cs="Times New Roman"/>
-          <w:b/>
-          <w:bCs/>
-          <w:sz w:val="20"/>
-          <w:szCs w:val="20"/>
-        </w:rPr>
-        <w:tab/>
-      </w:r>
-      <w:r>
-        <w:rPr>
-          <w:rFonts w:ascii="Times New Roman" w:eastAsia="Times New Roman" w:hAnsi="Times New Roman" w:cs="Times New Roman"/>
-          <w:b/>
-          <w:bCs/>
-          <w:sz w:val="20"/>
-          <w:szCs w:val="20"/>
-        </w:rPr>
-        <w:tab/>
-      </w:r>
-      <w:r>
-        <w:rPr>
-          <w:rFonts w:ascii="Times New Roman" w:eastAsia="Times New Roman" w:hAnsi="Times New Roman" w:cs="Times New Roman"/>
-          <w:b/>
-          <w:bCs/>
-          <w:sz w:val="20"/>
-          <w:szCs w:val="20"/>
-        </w:rPr>
-        <w:tab/>
-      </w:r>
-      <w:r>
-        <w:rPr>
-          <w:rFonts w:ascii="Times New Roman" w:eastAsia="Times New Roman" w:hAnsi="Times New Roman" w:cs="Times New Roman"/>
-          <w:b/>
-          <w:bCs/>
-          <w:sz w:val="20"/>
-          <w:szCs w:val="20"/>
-        </w:rPr>
-        <w:tab/>
-      </w:r>
-      <w:r>
-        <w:rPr>
-          <w:rFonts w:ascii="Times New Roman" w:eastAsia="Times New Roman" w:hAnsi="Times New Roman" w:cs="Times New Roman"/>
-          <w:b/>
-          <w:bCs/>
-          <w:sz w:val="20"/>
-          <w:szCs w:val="20"/>
-        </w:rPr>
-        <w:tab/>
-      </w:r>
-    </w:p>
-    <w:p>
-      <w:pPr>
-        <w:spacing w:after="120" w:line="240" w:lineRule="auto"/>
-        <w:ind w:left="-425" w:right="-436"/>
-        <w:rPr>
-          <w:rFonts w:ascii="Times New Roman" w:eastAsia="Times New Roman" w:hAnsi="Times New Roman" w:cs="Times New Roman"/>
+        <w:t>{{</w:t>
+      </w:r>
+      <w:proofErr w:type="spellStart"/>
+      <w:r>
+        <w:rPr>
+          <w:rFonts w:ascii="Times New Roman" w:eastAsia="Times New Roman" w:hAnsi="Times New Roman" w:cs="Times New Roman"/>
+          <w:b/>
+          <w:bCs/>
           <w:sz w:val="20"/>
           <w:szCs w:val="20"/>
           <w:lang w:val="en-US"/>
         </w:rPr>
-      </w:pPr>
-      <w:r>
-        <w:rPr>
-          <w:rFonts w:ascii="Times New Roman" w:eastAsia="Times New Roman" w:hAnsi="Times New Roman" w:cs="Times New Roman"/>
+        <w:t>clinicName</w:t>
+      </w:r>
+      <w:proofErr w:type="spellEnd"/>
+      <w:r>
+        <w:rPr>
+          <w:rFonts w:ascii="Times New Roman" w:eastAsia="Times New Roman" w:hAnsi="Times New Roman" w:cs="Times New Roman"/>
+          <w:b/>
+          <w:bCs/>
           <w:sz w:val="20"/>
           <w:szCs w:val="20"/>
           <w:lang w:val="en-US"/>
         </w:rPr>
-        <w:t>{{clinicAddress}}</w:t>
-      </w:r>
-    </w:p>
-    <w:p>
-      <w:pPr>
-        <w:spacing w:after="120" w:line="240" w:lineRule="auto"/>
-        <w:ind w:left="-425" w:right="-436"/>
-        <w:rPr>
-          <w:rFonts w:ascii="Times New Roman" w:eastAsia="Times New Roman" w:hAnsi="Times New Roman" w:cs="Times New Roman"/>
+        <w:t>}}</w:t>
+      </w:r>
+      <w:r>
+        <w:rPr>
+          <w:rFonts w:ascii="Times New Roman" w:eastAsia="Times New Roman" w:hAnsi="Times New Roman" w:cs="Times New Roman"/>
+          <w:b/>
+          <w:bCs/>
           <w:sz w:val="20"/>
           <w:szCs w:val="20"/>
           <w:lang w:val="en-US"/>
         </w:rPr>
-      </w:pPr>
-      <w:r>
-        <w:rPr>
-          <w:rFonts w:ascii="Times New Roman" w:eastAsia="Times New Roman" w:hAnsi="Times New Roman" w:cs="Times New Roman"/>
-          <w:sz w:val="20"/>
-          <w:szCs w:val="20"/>
-        </w:rPr>
-        <w:t xml:space="preserve">SĐT: </w:t>
+        <w:br/>
       </w:r>
       <w:r>
         <w:rPr>
@@ -153,7 +67,65 @@
           <w:szCs w:val="20"/>
           <w:lang w:val="en-US"/>
         </w:rPr>
-        <w:t>{{clinicPhones</w:t>
+        <w:t>{{</w:t>
+      </w:r>
+      <w:proofErr w:type="spellStart"/>
+      <w:r>
+        <w:rPr>
+          <w:rFonts w:ascii="Times New Roman" w:eastAsia="Times New Roman" w:hAnsi="Times New Roman" w:cs="Times New Roman"/>
+          <w:sz w:val="20"/>
+          <w:szCs w:val="20"/>
+          <w:lang w:val="en-US"/>
+        </w:rPr>
+        <w:t>clinicAddress</w:t>
+      </w:r>
+      <w:proofErr w:type="spellEnd"/>
+      <w:r>
+        <w:rPr>
+          <w:rFonts w:ascii="Times New Roman" w:eastAsia="Times New Roman" w:hAnsi="Times New Roman" w:cs="Times New Roman"/>
+          <w:sz w:val="20"/>
+          <w:szCs w:val="20"/>
+          <w:lang w:val="en-US"/>
+        </w:rPr>
+        <w:t>}}</w:t>
+      </w:r>
+      <w:r>
+        <w:rPr>
+          <w:rFonts w:ascii="Times New Roman" w:eastAsia="Times New Roman" w:hAnsi="Times New Roman" w:cs="Times New Roman"/>
+          <w:b/>
+          <w:bCs/>
+          <w:sz w:val="20"/>
+          <w:szCs w:val="20"/>
+          <w:lang w:val="en-US"/>
+        </w:rPr>
+        <w:br/>
+      </w:r>
+      <w:r>
+        <w:rPr>
+          <w:rFonts w:ascii="Times New Roman" w:eastAsia="Times New Roman" w:hAnsi="Times New Roman" w:cs="Times New Roman"/>
+          <w:sz w:val="20"/>
+          <w:szCs w:val="20"/>
+        </w:rPr>
+        <w:t xml:space="preserve">SĐT: </w:t>
+      </w:r>
+      <w:r>
+        <w:rPr>
+          <w:rFonts w:ascii="Times New Roman" w:eastAsia="Times New Roman" w:hAnsi="Times New Roman" w:cs="Times New Roman"/>
+          <w:sz w:val="20"/>
+          <w:szCs w:val="20"/>
+          <w:lang w:val="en-US"/>
+        </w:rPr>
+        <w:t>{{</w:t>
+      </w:r>
+      <w:proofErr w:type="spellStart"/>
+      <w:r>
+        <w:rPr>
+          <w:rFonts w:ascii="Times New Roman" w:eastAsia="Times New Roman" w:hAnsi="Times New Roman" w:cs="Times New Roman"/>
+          <w:sz w:val="20"/>
+          <w:szCs w:val="20"/>
+          <w:lang w:val="en-US"/>
+        </w:rPr>
+        <w:t>clinicPhones</w:t>
       </w:r>
       <w:r>
         <w:rPr>
@@ -164,6 +136,7 @@
         </w:rPr>
         <w:t>Text</w:t>
       </w:r>
+      <w:proofErr w:type="spellEnd"/>
       <w:r>
         <w:rPr>
           <w:rFonts w:ascii="Times New Roman" w:eastAsia="Times New Roman" w:hAnsi="Times New Roman" w:cs="Times New Roman"/>
@@ -1204,7 +1177,27 @@
           <w:bCs/>
           <w:lang w:val="en-US"/>
         </w:rPr>
-        <w:t>{{doctorName}}</w:t>
+        <w:t>{{</w:t>
+      </w:r>
+      <w:proofErr w:type="spellStart"/>
+      <w:r>
+        <w:rPr>
+          <w:rFonts w:ascii="Times New Roman" w:eastAsia="Times New Roman" w:hAnsi="Times New Roman" w:cs="Times New Roman"/>
+          <w:b/>
+          <w:bCs/>
+          <w:lang w:val="en-US"/>
+        </w:rPr>
+        <w:t>doctorName</w:t>
+      </w:r>
+      <w:proofErr w:type="spellEnd"/>
+      <w:r>
+        <w:rPr>
+          <w:rFonts w:ascii="Times New Roman" w:eastAsia="Times New Roman" w:hAnsi="Times New Roman" w:cs="Times New Roman"/>
+          <w:b/>
+          <w:bCs/>
+          <w:lang w:val="en-US"/>
+        </w:rPr>
+        <w:t>}}</w:t>
       </w:r>
     </w:p>
     <w:sectPr>

</xml_diff>